<commit_message>
fix(review): 리뷰 Important 4건 반영
- 레이아웃: 1D 간격 풀이를 하한/상한 동시 만족형으로 교체(진동 제거), extraGap 상한, 수렴 허용오차 CONV_TOL,
  반복 상한 후 최종 반지름/근접 패스 → 겹침 0 (리뷰 재현 입력 V3-17)
- app: vllm 후보에도 combat_count 강제 (BE-T18, 가짜 vLLM 서버 테스트)
- validator: 입력 단계에서 points/areas 64개로 선절단 + combat 제거 단일 filter (80k areas 57s → <1s, V3-18)
- 해석기: 전투 수는 전투 단어 근처 숫자만, '적'은 단독 어절만, 영어 키워드 단어 경계, '눈'은 설원 표현만 (RULE-14/15)

Co-Authored-By: Claude Fable 5.1 <noreply@anthropic.com>
</commit_message>
<xml_diff>
--- a/docs/TEST_RESULTS_1차.docx
+++ b/docs/TEST_RESULTS_1차.docx
@@ -13,14 +13,14 @@
     </w:p>
     <w:p>
       <w:r>
-        <w:t xml:space="preserve">생성: 2026-10-28 10:39 (로컬) · 대상 커밋: </w:t>
+        <w:t xml:space="preserve">생성: 2026-10-28 11:01 (로컬) · 대상 커밋: </w:t>
       </w:r>
       <w:r>
         <w:rPr>
           <w:rFonts w:ascii="Consolas" w:hAnsi="Consolas"/>
           <w:sz w:val="18"/>
         </w:rPr>
-        <w:t>ea3f1a4</w:t>
+        <w:t>67ab7d8</w:t>
       </w:r>
       <w:r>
         <w:t xml:space="preserve"> (feat/validator-v3, 2026-10-28) · Node v22.21.0 · win32</w:t>
@@ -259,7 +259,7 @@
                 <w:rFonts w:ascii="Consolas" w:hAnsi="Consolas"/>
                 <w:sz w:val="18"/>
               </w:rPr>
-              <w:t>ea3f1a4</w:t>
+              <w:t>67ab7d8</w:t>
             </w:r>
           </w:p>
         </w:tc>
@@ -621,7 +621,7 @@
               <w:rPr>
                 <w:sz w:val="18"/>
               </w:rPr>
-              <w:t>93</w:t>
+              <w:t>97</w:t>
             </w:r>
           </w:p>
         </w:tc>
@@ -639,7 +639,7 @@
               <w:rPr>
                 <w:sz w:val="18"/>
               </w:rPr>
-              <w:t>93</w:t>
+              <w:t>97</w:t>
             </w:r>
           </w:p>
         </w:tc>
@@ -853,7 +853,7 @@
               <w:rPr>
                 <w:sz w:val="18"/>
               </w:rPr>
-              <w:t>20.26</w:t>
+              <w:t>19.87</w:t>
             </w:r>
           </w:p>
         </w:tc>
@@ -889,7 +889,7 @@
               <w:rPr>
                 <w:sz w:val="18"/>
               </w:rPr>
-              <w:t>0.158</w:t>
+              <w:t>0.163</w:t>
             </w:r>
           </w:p>
         </w:tc>
@@ -1048,7 +1048,7 @@
               <w:rPr>
                 <w:sz w:val="18"/>
               </w:rPr>
-              <w:t>2.7 ms</w:t>
+              <w:t>4.2 ms</w:t>
             </w:r>
           </w:p>
         </w:tc>
@@ -1164,7 +1164,7 @@
               <w:rPr>
                 <w:sz w:val="18"/>
               </w:rPr>
-              <w:t>1.2 ms</w:t>
+              <w:t>1.4 ms</w:t>
             </w:r>
           </w:p>
         </w:tc>
@@ -1396,7 +1396,7 @@
               <w:rPr>
                 <w:sz w:val="18"/>
               </w:rPr>
-              <w:t>1.0 ms</w:t>
+              <w:t>0.8 ms</w:t>
             </w:r>
           </w:p>
         </w:tc>
@@ -1454,7 +1454,7 @@
               <w:rPr>
                 <w:sz w:val="18"/>
               </w:rPr>
-              <w:t>0.5 ms</w:t>
+              <w:t>0.3 ms</w:t>
             </w:r>
           </w:p>
         </w:tc>
@@ -1512,7 +1512,7 @@
               <w:rPr>
                 <w:sz w:val="18"/>
               </w:rPr>
-              <w:t>0.8 ms</w:t>
+              <w:t>0.7 ms</w:t>
             </w:r>
           </w:p>
         </w:tc>
@@ -1570,7 +1570,7 @@
               <w:rPr>
                 <w:sz w:val="18"/>
               </w:rPr>
-              <w:t>0.4 ms</w:t>
+              <w:t>0.5 ms</w:t>
             </w:r>
           </w:p>
         </w:tc>
@@ -1628,7 +1628,7 @@
               <w:rPr>
                 <w:sz w:val="18"/>
               </w:rPr>
-              <w:t>0.2 ms</w:t>
+              <w:t>0.3 ms</w:t>
             </w:r>
           </w:p>
         </w:tc>
@@ -1744,7 +1744,7 @@
               <w:rPr>
                 <w:sz w:val="18"/>
               </w:rPr>
-              <w:t>0.3 ms</w:t>
+              <w:t>0.5 ms</w:t>
             </w:r>
           </w:p>
         </w:tc>
@@ -1802,7 +1802,7 @@
               <w:rPr>
                 <w:sz w:val="18"/>
               </w:rPr>
-              <w:t>0.8 ms</w:t>
+              <w:t>0.3 ms</w:t>
             </w:r>
           </w:p>
         </w:tc>
@@ -1860,7 +1860,7 @@
               <w:rPr>
                 <w:sz w:val="18"/>
               </w:rPr>
-              <w:t>0.3 ms</w:t>
+              <w:t>0.4 ms</w:t>
             </w:r>
           </w:p>
         </w:tc>
@@ -1976,7 +1976,7 @@
               <w:rPr>
                 <w:sz w:val="18"/>
               </w:rPr>
-              <w:t>0.7 ms</w:t>
+              <w:t>1.3 ms</w:t>
             </w:r>
           </w:p>
         </w:tc>
@@ -2092,7 +2092,7 @@
               <w:rPr>
                 <w:sz w:val="18"/>
               </w:rPr>
-              <w:t>0.1 ms</w:t>
+              <w:t>0.2 ms</w:t>
             </w:r>
           </w:p>
         </w:tc>
@@ -2208,7 +2208,7 @@
               <w:rPr>
                 <w:sz w:val="18"/>
               </w:rPr>
-              <w:t>0.1 ms</w:t>
+              <w:t>0.2 ms</w:t>
             </w:r>
           </w:p>
         </w:tc>
@@ -2324,7 +2324,7 @@
               <w:rPr>
                 <w:sz w:val="18"/>
               </w:rPr>
-              <w:t>0.3 ms</w:t>
+              <w:t>0.4 ms</w:t>
             </w:r>
           </w:p>
         </w:tc>
@@ -2498,7 +2498,123 @@
               <w:rPr>
                 <w:sz w:val="18"/>
               </w:rPr>
-              <w:t>0.3 ms</w:t>
+              <w:t>0.2 ms</w:t>
+            </w:r>
+          </w:p>
+        </w:tc>
+      </w:tr>
+      <w:tr>
+        <w:tc>
+          <w:tcPr>
+            <w:tcW w:type="dxa" w:w="2880"/>
+          </w:tcPr>
+          <w:p>
+            <w:r>
+              <w:rPr>
+                <w:sz w:val="18"/>
+              </w:rPr>
+            </w:r>
+            <w:r>
+              <w:rPr>
+                <w:sz w:val="18"/>
+              </w:rPr>
+              <w:t>V3-17 (리뷰 Important-1) 레이아웃 루프가 상한에 걸려도 최종 반지름 패스로 겹침 0</w:t>
+            </w:r>
+          </w:p>
+        </w:tc>
+        <w:tc>
+          <w:tcPr>
+            <w:tcW w:type="dxa" w:w="2880"/>
+          </w:tcPr>
+          <w:p>
+            <w:r>
+              <w:rPr>
+                <w:color w:val="1E7B34"/>
+                <w:sz w:val="18"/>
+              </w:rPr>
+            </w:r>
+            <w:r>
+              <w:rPr>
+                <w:color w:val="1E7B34"/>
+                <w:sz w:val="18"/>
+              </w:rPr>
+              <w:t>PASS</w:t>
+            </w:r>
+          </w:p>
+        </w:tc>
+        <w:tc>
+          <w:tcPr>
+            <w:tcW w:type="dxa" w:w="2880"/>
+          </w:tcPr>
+          <w:p>
+            <w:r>
+              <w:rPr>
+                <w:sz w:val="18"/>
+              </w:rPr>
+            </w:r>
+            <w:r>
+              <w:rPr>
+                <w:sz w:val="18"/>
+              </w:rPr>
+              <w:t>0.6 ms</w:t>
+            </w:r>
+          </w:p>
+        </w:tc>
+      </w:tr>
+      <w:tr>
+        <w:tc>
+          <w:tcPr>
+            <w:tcW w:type="dxa" w:w="2880"/>
+          </w:tcPr>
+          <w:p>
+            <w:r>
+              <w:rPr>
+                <w:sz w:val="18"/>
+              </w:rPr>
+            </w:r>
+            <w:r>
+              <w:rPr>
+                <w:sz w:val="18"/>
+              </w:rPr>
+              <w:t>V3-18 (리뷰 Important-3) areas 80,000개 + combat_count 0 → 1초 이내</w:t>
+            </w:r>
+          </w:p>
+        </w:tc>
+        <w:tc>
+          <w:tcPr>
+            <w:tcW w:type="dxa" w:w="2880"/>
+          </w:tcPr>
+          <w:p>
+            <w:r>
+              <w:rPr>
+                <w:color w:val="1E7B34"/>
+                <w:sz w:val="18"/>
+              </w:rPr>
+            </w:r>
+            <w:r>
+              <w:rPr>
+                <w:color w:val="1E7B34"/>
+                <w:sz w:val="18"/>
+              </w:rPr>
+              <w:t>PASS</w:t>
+            </w:r>
+          </w:p>
+        </w:tc>
+        <w:tc>
+          <w:tcPr>
+            <w:tcW w:type="dxa" w:w="2880"/>
+          </w:tcPr>
+          <w:p>
+            <w:r>
+              <w:rPr>
+                <w:sz w:val="18"/>
+              </w:rPr>
+            </w:r>
+            <w:r>
+              <w:rPr>
+                <w:sz w:val="18"/>
+              </w:rPr>
+              <w:t>16.4 ms</w:t>
             </w:r>
           </w:p>
         </w:tc>
@@ -2640,7 +2756,7 @@
               <w:rPr>
                 <w:sz w:val="18"/>
               </w:rPr>
-              <w:t>349.4 ms</w:t>
+              <w:t>386.6 ms</w:t>
             </w:r>
           </w:p>
         </w:tc>
@@ -2782,7 +2898,7 @@
               <w:rPr>
                 <w:sz w:val="18"/>
               </w:rPr>
-              <w:t>0.8 ms</w:t>
+              <w:t>1.1 ms</w:t>
             </w:r>
           </w:p>
         </w:tc>
@@ -2956,7 +3072,7 @@
               <w:rPr>
                 <w:sz w:val="18"/>
               </w:rPr>
-              <w:t>0.9 ms</w:t>
+              <w:t>1.3 ms</w:t>
             </w:r>
           </w:p>
         </w:tc>
@@ -3362,7 +3478,7 @@
               <w:rPr>
                 <w:sz w:val="18"/>
               </w:rPr>
-              <w:t>0.3 ms</w:t>
+              <w:t>0.4 ms</w:t>
             </w:r>
           </w:p>
         </w:tc>
@@ -3420,7 +3536,7 @@
               <w:rPr>
                 <w:sz w:val="18"/>
               </w:rPr>
-              <w:t>0.1 ms</w:t>
+              <w:t>0.2 ms</w:t>
             </w:r>
           </w:p>
         </w:tc>
@@ -3478,7 +3594,7 @@
               <w:rPr>
                 <w:sz w:val="18"/>
               </w:rPr>
-              <w:t>0.2 ms</w:t>
+              <w:t>0.3 ms</w:t>
             </w:r>
           </w:p>
         </w:tc>
@@ -3678,7 +3794,7 @@
               <w:rPr>
                 <w:sz w:val="18"/>
               </w:rPr>
-              <w:t>1.4 ms</w:t>
+              <w:t>1.5 ms</w:t>
             </w:r>
           </w:p>
         </w:tc>
@@ -3852,7 +3968,7 @@
               <w:rPr>
                 <w:sz w:val="18"/>
               </w:rPr>
-              <w:t>0.2 ms</w:t>
+              <w:t>0.1 ms</w:t>
             </w:r>
           </w:p>
         </w:tc>
@@ -4226,7 +4342,7 @@
               <w:rPr>
                 <w:sz w:val="18"/>
               </w:rPr>
-              <w:t>2.6 ms</w:t>
+              <w:t>4.6 ms</w:t>
             </w:r>
           </w:p>
         </w:tc>
@@ -4284,7 +4400,7 @@
               <w:rPr>
                 <w:sz w:val="18"/>
               </w:rPr>
-              <w:t>0.5 ms</w:t>
+              <w:t>0.9 ms</w:t>
             </w:r>
           </w:p>
         </w:tc>
@@ -4342,7 +4458,7 @@
               <w:rPr>
                 <w:sz w:val="18"/>
               </w:rPr>
-              <w:t>0.3 ms</w:t>
+              <w:t>0.5 ms</w:t>
             </w:r>
           </w:p>
         </w:tc>
@@ -4400,7 +4516,7 @@
               <w:rPr>
                 <w:sz w:val="18"/>
               </w:rPr>
-              <w:t>0.3 ms</w:t>
+              <w:t>1.1 ms</w:t>
             </w:r>
           </w:p>
         </w:tc>
@@ -4458,7 +4574,7 @@
               <w:rPr>
                 <w:sz w:val="18"/>
               </w:rPr>
-              <w:t>0.3 ms</w:t>
+              <w:t>0.6 ms</w:t>
             </w:r>
           </w:p>
         </w:tc>
@@ -4516,7 +4632,7 @@
               <w:rPr>
                 <w:sz w:val="18"/>
               </w:rPr>
-              <w:t>0.1 ms</w:t>
+              <w:t>0.2 ms</w:t>
             </w:r>
           </w:p>
         </w:tc>
@@ -4574,7 +4690,7 @@
               <w:rPr>
                 <w:sz w:val="18"/>
               </w:rPr>
-              <w:t>0.1 ms</w:t>
+              <w:t>0.3 ms</w:t>
             </w:r>
           </w:p>
         </w:tc>
@@ -4632,7 +4748,7 @@
               <w:rPr>
                 <w:sz w:val="18"/>
               </w:rPr>
-              <w:t>0.8 ms</w:t>
+              <w:t>0.2 ms</w:t>
             </w:r>
           </w:p>
         </w:tc>
@@ -4690,7 +4806,7 @@
               <w:rPr>
                 <w:sz w:val="18"/>
               </w:rPr>
-              <w:t>0.5 ms</w:t>
+              <w:t>0.4 ms</w:t>
             </w:r>
           </w:p>
         </w:tc>
@@ -4748,7 +4864,7 @@
               <w:rPr>
                 <w:sz w:val="18"/>
               </w:rPr>
-              <w:t>1.5 ms</w:t>
+              <w:t>1.9 ms</w:t>
             </w:r>
           </w:p>
         </w:tc>
@@ -4806,7 +4922,7 @@
               <w:rPr>
                 <w:sz w:val="18"/>
               </w:rPr>
-              <w:t>63.8 ms</w:t>
+              <w:t>76.2 ms</w:t>
             </w:r>
           </w:p>
         </w:tc>
@@ -4864,7 +4980,7 @@
               <w:rPr>
                 <w:sz w:val="18"/>
               </w:rPr>
-              <w:t>2.6 ms</w:t>
+              <w:t>3.5 ms</w:t>
             </w:r>
           </w:p>
         </w:tc>
@@ -4922,7 +5038,123 @@
               <w:rPr>
                 <w:sz w:val="18"/>
               </w:rPr>
-              <w:t>0.3 ms</w:t>
+              <w:t>0.6 ms</w:t>
+            </w:r>
+          </w:p>
+        </w:tc>
+      </w:tr>
+      <w:tr>
+        <w:tc>
+          <w:tcPr>
+            <w:tcW w:type="dxa" w:w="2880"/>
+          </w:tcPr>
+          <w:p>
+            <w:r>
+              <w:rPr>
+                <w:sz w:val="18"/>
+              </w:rPr>
+            </w:r>
+            <w:r>
+              <w:rPr>
+                <w:sz w:val="18"/>
+              </w:rPr>
+              <w:t>RULE-14 (리뷰 Important-4) 전투와 무관한 숫자/단어는 전투 수로 세지 않음</w:t>
+            </w:r>
+          </w:p>
+        </w:tc>
+        <w:tc>
+          <w:tcPr>
+            <w:tcW w:type="dxa" w:w="2880"/>
+          </w:tcPr>
+          <w:p>
+            <w:r>
+              <w:rPr>
+                <w:color w:val="1E7B34"/>
+                <w:sz w:val="18"/>
+              </w:rPr>
+            </w:r>
+            <w:r>
+              <w:rPr>
+                <w:color w:val="1E7B34"/>
+                <w:sz w:val="18"/>
+              </w:rPr>
+              <w:t>PASS</w:t>
+            </w:r>
+          </w:p>
+        </w:tc>
+        <w:tc>
+          <w:tcPr>
+            <w:tcW w:type="dxa" w:w="2880"/>
+          </w:tcPr>
+          <w:p>
+            <w:r>
+              <w:rPr>
+                <w:sz w:val="18"/>
+              </w:rPr>
+            </w:r>
+            <w:r>
+              <w:rPr>
+                <w:sz w:val="18"/>
+              </w:rPr>
+              <w:t>1.2 ms</w:t>
+            </w:r>
+          </w:p>
+        </w:tc>
+      </w:tr>
+      <w:tr>
+        <w:tc>
+          <w:tcPr>
+            <w:tcW w:type="dxa" w:w="2880"/>
+          </w:tcPr>
+          <w:p>
+            <w:r>
+              <w:rPr>
+                <w:sz w:val="18"/>
+              </w:rPr>
+            </w:r>
+            <w:r>
+              <w:rPr>
+                <w:sz w:val="18"/>
+              </w:rPr>
+              <w:t>RULE-15 (리뷰 Important-4) 영어 키워드는 단어 경계, '눈'은 눈앞/눈치에 안 걸림</w:t>
+            </w:r>
+          </w:p>
+        </w:tc>
+        <w:tc>
+          <w:tcPr>
+            <w:tcW w:type="dxa" w:w="2880"/>
+          </w:tcPr>
+          <w:p>
+            <w:r>
+              <w:rPr>
+                <w:color w:val="1E7B34"/>
+                <w:sz w:val="18"/>
+              </w:rPr>
+            </w:r>
+            <w:r>
+              <w:rPr>
+                <w:color w:val="1E7B34"/>
+                <w:sz w:val="18"/>
+              </w:rPr>
+              <w:t>PASS</w:t>
+            </w:r>
+          </w:p>
+        </w:tc>
+        <w:tc>
+          <w:tcPr>
+            <w:tcW w:type="dxa" w:w="2880"/>
+          </w:tcPr>
+          <w:p>
+            <w:r>
+              <w:rPr>
+                <w:sz w:val="18"/>
+              </w:rPr>
+            </w:r>
+            <w:r>
+              <w:rPr>
+                <w:sz w:val="18"/>
+              </w:rPr>
+              <w:t>0.6 ms</w:t>
             </w:r>
           </w:p>
         </w:tc>
@@ -5064,7 +5296,7 @@
               <w:rPr>
                 <w:sz w:val="18"/>
               </w:rPr>
-              <w:t>23.7 ms</w:t>
+              <w:t>26.5 ms</w:t>
             </w:r>
           </w:p>
         </w:tc>
@@ -5122,7 +5354,7 @@
               <w:rPr>
                 <w:sz w:val="18"/>
               </w:rPr>
-              <w:t>1.9 ms</w:t>
+              <w:t>4.2 ms</w:t>
             </w:r>
           </w:p>
         </w:tc>
@@ -5180,7 +5412,7 @@
               <w:rPr>
                 <w:sz w:val="18"/>
               </w:rPr>
-              <w:t>54.3 ms</w:t>
+              <w:t>51.5 ms</w:t>
             </w:r>
           </w:p>
         </w:tc>
@@ -5412,7 +5644,7 @@
               <w:rPr>
                 <w:sz w:val="18"/>
               </w:rPr>
-              <w:t>0.9 ms</w:t>
+              <w:t>1.2 ms</w:t>
             </w:r>
           </w:p>
         </w:tc>
@@ -5528,7 +5760,7 @@
               <w:rPr>
                 <w:sz w:val="18"/>
               </w:rPr>
-              <w:t>0.2 ms</w:t>
+              <w:t>0.3 ms</w:t>
             </w:r>
           </w:p>
         </w:tc>
@@ -5670,7 +5902,7 @@
               <w:rPr>
                 <w:sz w:val="18"/>
               </w:rPr>
-              <w:t>3.9 ms</w:t>
+              <w:t>4.5 ms</w:t>
             </w:r>
           </w:p>
         </w:tc>
@@ -5844,7 +6076,7 @@
               <w:rPr>
                 <w:sz w:val="18"/>
               </w:rPr>
-              <w:t>0.5 ms</w:t>
+              <w:t>0.6 ms</w:t>
             </w:r>
           </w:p>
         </w:tc>
@@ -5902,7 +6134,7 @@
               <w:rPr>
                 <w:sz w:val="18"/>
               </w:rPr>
-              <w:t>0.5 ms</w:t>
+              <w:t>0.8 ms</w:t>
             </w:r>
           </w:p>
         </w:tc>
@@ -6076,7 +6308,7 @@
               <w:rPr>
                 <w:sz w:val="18"/>
               </w:rPr>
-              <w:t>0.4 ms</w:t>
+              <w:t>0.5 ms</w:t>
             </w:r>
           </w:p>
         </w:tc>
@@ -6218,7 +6450,7 @@
               <w:rPr>
                 <w:sz w:val="18"/>
               </w:rPr>
-              <w:t>37.1 ms</w:t>
+              <w:t>41.2 ms</w:t>
             </w:r>
           </w:p>
         </w:tc>
@@ -6334,7 +6566,7 @@
               <w:rPr>
                 <w:sz w:val="18"/>
               </w:rPr>
-              <w:t>4.2 ms</w:t>
+              <w:t>4.6 ms</w:t>
             </w:r>
           </w:p>
         </w:tc>
@@ -6392,7 +6624,7 @@
               <w:rPr>
                 <w:sz w:val="18"/>
               </w:rPr>
-              <w:t>8.8 ms</w:t>
+              <w:t>10.5 ms</w:t>
             </w:r>
           </w:p>
         </w:tc>
@@ -6450,7 +6682,7 @@
               <w:rPr>
                 <w:sz w:val="18"/>
               </w:rPr>
-              <w:t>4.5 ms</w:t>
+              <w:t>7.2 ms</w:t>
             </w:r>
           </w:p>
         </w:tc>
@@ -6508,7 +6740,7 @@
               <w:rPr>
                 <w:sz w:val="18"/>
               </w:rPr>
-              <w:t>7.7 ms</w:t>
+              <w:t>10.7 ms</w:t>
             </w:r>
           </w:p>
         </w:tc>
@@ -6566,7 +6798,7 @@
               <w:rPr>
                 <w:sz w:val="18"/>
               </w:rPr>
-              <w:t>6.5 ms</w:t>
+              <w:t>9.1 ms</w:t>
             </w:r>
           </w:p>
         </w:tc>
@@ -6624,7 +6856,7 @@
               <w:rPr>
                 <w:sz w:val="18"/>
               </w:rPr>
-              <w:t>3.5 ms</w:t>
+              <w:t>4.5 ms</w:t>
             </w:r>
           </w:p>
         </w:tc>
@@ -6682,7 +6914,7 @@
               <w:rPr>
                 <w:sz w:val="18"/>
               </w:rPr>
-              <w:t>6.4 ms</w:t>
+              <w:t>6.0 ms</w:t>
             </w:r>
           </w:p>
         </w:tc>
@@ -6740,7 +6972,7 @@
               <w:rPr>
                 <w:sz w:val="18"/>
               </w:rPr>
-              <w:t>518.1 ms</w:t>
+              <w:t>506.7 ms</w:t>
             </w:r>
           </w:p>
         </w:tc>
@@ -6882,7 +7114,7 @@
               <w:rPr>
                 <w:sz w:val="18"/>
               </w:rPr>
-              <w:t>9.4 ms</w:t>
+              <w:t>13.6 ms</w:t>
             </w:r>
           </w:p>
         </w:tc>
@@ -6940,7 +7172,7 @@
               <w:rPr>
                 <w:sz w:val="18"/>
               </w:rPr>
-              <w:t>5.8 ms</w:t>
+              <w:t>6.3 ms</w:t>
             </w:r>
           </w:p>
         </w:tc>
@@ -6998,7 +7230,7 @@
               <w:rPr>
                 <w:sz w:val="18"/>
               </w:rPr>
-              <w:t>1.8 ms</w:t>
+              <w:t>3.6 ms</w:t>
             </w:r>
           </w:p>
         </w:tc>
@@ -7056,7 +7288,7 @@
               <w:rPr>
                 <w:sz w:val="18"/>
               </w:rPr>
-              <w:t>0.2 ms</w:t>
+              <w:t>0.3 ms</w:t>
             </w:r>
           </w:p>
         </w:tc>

</xml_diff>